<commit_message>
hib adversary-complaint: the docx caption's rows each a table of its own, 0.1 pt apart (LibreOffice draws a rule above a row a table carries to a new page; typst's rows are blocks of their own); docx XENG-001..003 still pass on both INPUTs; typst 18 and docx 26 checks passed, 0 failed (fb-595.68.22)
</commit_message>
<xml_diff>
--- a/courts/ninth-circuit/hawaii/federal/bankruptcy-district/adversary-complaint/usage/OUTPUT-adversary-complaint-2.docx
+++ b/courts/ninth-circuit/hawaii/federal/bankruptcy-district/adversary-complaint/usage/OUTPUT-adversary-complaint-2.docx
@@ -989,6 +989,30 @@
           </w:p>
         </w:tc>
       </w:tr>
+    </w:tbl>
+    <w:p>
+      <w:pPr>
+        <w:spacing w:before="0" w:after="0" w:line="2" w:lineRule="exact"/>
+        <w:ind w:left="0" w:firstLine="0"/>
+        <w:jc w:val="left"/>
+      </w:pPr>
+    </w:p>
+    <w:tbl>
+      <w:tblPr>
+        <w:tblW w:w="9360" w:type="dxa"/>
+        <w:tblLayout w:type="fixed"/>
+        <w:tblCellMar>
+          <w:top w:w="0" w:type="dxa"/>
+          <w:left w:w="0" w:type="dxa"/>
+          <w:bottom w:w="0" w:type="dxa"/>
+          <w:right w:w="0" w:type="dxa"/>
+        </w:tblCellMar>
+        <w:tblLook w:val="0000" w:firstRow="0" w:lastRow="0" w:firstColumn="0" w:lastColumn="0" w:noHBand="0" w:noVBand="0"/>
+      </w:tblPr>
+      <w:tblGrid>
+        <w:gridCol w:w="4680"/>
+        <w:gridCol w:w="4680"/>
+      </w:tblGrid>
       <w:tr>
         <w:trPr>
           <w:cantSplit/>

</xml_diff>